<commit_message>
Updated the Setup instructions.
</commit_message>
<xml_diff>
--- a/Setup_Instructions.docx
+++ b/Setup_Instructions.docx
@@ -5,9 +5,40 @@
     <w:p>
       <w:pPr>
         <w:jc w:val="center"/>
-      </w:pPr>
-      <w:r>
+        <w:rPr>
+          <w:b/>
+          <w:bCs/>
+        </w:rPr>
+      </w:pPr>
+      <w:r>
+        <w:rPr>
+          <w:b/>
+          <w:bCs/>
+        </w:rPr>
         <w:t>James Zacka Coding Instructions</w:t>
+      </w:r>
+      <w:r>
+        <w:rPr>
+          <w:b/>
+          <w:bCs/>
+        </w:rPr>
+        <w:t xml:space="preserve"> </w:t>
+      </w:r>
+    </w:p>
+    <w:p>
+      <w:pPr>
+        <w:jc w:val="center"/>
+        <w:rPr>
+          <w:i/>
+          <w:iCs/>
+        </w:rPr>
+      </w:pPr>
+      <w:r>
+        <w:rPr>
+          <w:i/>
+          <w:iCs/>
+        </w:rPr>
+        <w:t>(Updated: 11/4/2025)</w:t>
       </w:r>
     </w:p>
     <w:p>
@@ -360,6 +391,149 @@
       </w:r>
       <w:r>
         <w:t xml:space="preserve"> and try the controls and buttons.</w:t>
+      </w:r>
+      <w:r>
+        <w:br/>
+      </w:r>
+      <w:r>
+        <w:br/>
+      </w:r>
+      <w:r>
+        <w:t>*</w:t>
+      </w:r>
+      <w:r>
+        <w:t>Update</w:t>
+      </w:r>
+      <w:r>
+        <w:t xml:space="preserve"> (11/4/2025):  I added an AI prompt for fetching records from the database.  You can type in any prompt that can fetch records from the database and display it into the database.</w:t>
+      </w:r>
+      <w:r>
+        <w:br/>
+      </w:r>
+      <w:r>
+        <w:br/>
+        <w:t>Ex:</w:t>
+      </w:r>
+    </w:p>
+    <w:p>
+      <w:r>
+        <w:t>Show employees older than 50</w:t>
+      </w:r>
+    </w:p>
+    <w:p>
+      <w:r>
+        <w:t>Find people younger than 30</w:t>
+      </w:r>
+    </w:p>
+    <w:p>
+      <w:r>
+        <w:t>Show employees named John</w:t>
+      </w:r>
+    </w:p>
+    <w:p>
+      <w:r>
+        <w:t>People older than 40 named Patel</w:t>
+      </w:r>
+    </w:p>
+    <w:p/>
+    <w:p>
+      <w:r>
+        <w:lastRenderedPageBreak/>
+        <w:drawing>
+          <wp:inline distT="0" distB="0" distL="0" distR="0" wp14:anchorId="5DED2602" wp14:editId="151B1ED2">
+            <wp:extent cx="5550185" cy="3130711"/>
+            <wp:effectExtent l="0" t="0" r="0" b="0"/>
+            <wp:docPr id="1089865101" name="Picture 1" descr="A screenshot of a computer&#10;&#10;AI-generated content may be incorrect."/>
+            <wp:cNvGraphicFramePr>
+              <a:graphicFrameLocks xmlns:a="http://schemas.openxmlformats.org/drawingml/2006/main" noChangeAspect="1"/>
+            </wp:cNvGraphicFramePr>
+            <a:graphic xmlns:a="http://schemas.openxmlformats.org/drawingml/2006/main">
+              <a:graphicData uri="http://schemas.openxmlformats.org/drawingml/2006/picture">
+                <pic:pic xmlns:pic="http://schemas.openxmlformats.org/drawingml/2006/picture">
+                  <pic:nvPicPr>
+                    <pic:cNvPr id="1089865101" name="Picture 1" descr="A screenshot of a computer&#10;&#10;AI-generated content may be incorrect."/>
+                    <pic:cNvPicPr/>
+                  </pic:nvPicPr>
+                  <pic:blipFill>
+                    <a:blip r:embed="rId8"/>
+                    <a:stretch>
+                      <a:fillRect/>
+                    </a:stretch>
+                  </pic:blipFill>
+                  <pic:spPr>
+                    <a:xfrm>
+                      <a:off x="0" y="0"/>
+                      <a:ext cx="5550185" cy="3130711"/>
+                    </a:xfrm>
+                    <a:prstGeom prst="rect">
+                      <a:avLst/>
+                    </a:prstGeom>
+                  </pic:spPr>
+                </pic:pic>
+              </a:graphicData>
+            </a:graphic>
+          </wp:inline>
+        </w:drawing>
+      </w:r>
+    </w:p>
+    <w:p>
+      <w:pPr>
+        <w:tabs>
+          <w:tab w:val="left" w:pos="2890"/>
+        </w:tabs>
+      </w:pPr>
+      <w:r>
+        <w:t>For the prompt to work properly, you need to run the python script provided in the solution.</w:t>
+      </w:r>
+      <w:r>
+        <w:br/>
+      </w:r>
+    </w:p>
+    <w:p>
+      <w:pPr>
+        <w:tabs>
+          <w:tab w:val="left" w:pos="2890"/>
+        </w:tabs>
+      </w:pPr>
+      <w:r>
+        <w:br/>
+        <w:t>Install the packages using the following command in the Python Project directory:</w:t>
+      </w:r>
+    </w:p>
+    <w:p>
+      <w:pPr>
+        <w:tabs>
+          <w:tab w:val="left" w:pos="2890"/>
+        </w:tabs>
+      </w:pPr>
+      <w:r>
+        <w:t>pip install -r requirements.txt</w:t>
+      </w:r>
+      <w:r>
+        <w:br/>
+      </w:r>
+      <w:r>
+        <w:br/>
+      </w:r>
+      <w:r>
+        <w:br/>
+        <w:t>Run the following command in the Python project directory using Powershell or CMD:</w:t>
+      </w:r>
+      <w:r>
+        <w:br/>
+      </w:r>
+      <w:r>
+        <w:br/>
+      </w:r>
+      <w:r>
+        <w:t>uvicorn nlp_service:app --reload --port 8000</w:t>
+      </w:r>
+      <w:r>
+        <w:br/>
+      </w:r>
+      <w:r>
+        <w:br/>
+        <w:t>This will run the API in order for the prompt to use.</w:t>
       </w:r>
     </w:p>
     <w:p>
@@ -1240,7 +1414,6 @@
   <w:style w:type="character" w:default="1" w:styleId="DefaultParagraphFont">
     <w:name w:val="Default Paragraph Font"/>
     <w:uiPriority w:val="1"/>
-    <w:semiHidden/>
     <w:unhideWhenUsed/>
   </w:style>
   <w:style w:type="table" w:default="1" w:styleId="TableNormal">

</xml_diff>